<commit_message>
Expand assignment answers to fully use allowed line limits
Co-Authored-By: Claude Fable 5 <noreply@anthropic.com>
Claude-Session: https://claude.ai/code/session_012XXMnuQ2SLoTVvDfXfh3KT
</commit_message>
<xml_diff>
--- a/docs/מטלת סיום פיזיולוגיה - זיהום אור - עם תשובות.docx
+++ b/docs/מטלת סיום פיזיולוגיה - זיהום אור - עם תשובות.docx
@@ -345,7 +345,7 @@
         <w:rPr>
           <w:rtl/>
         </w:rPr>
-        <w:t xml:space="preserve">זיהום אור הוא מונח המאגד את כלל ההשפעות השליליות של תאורה מלאכותית: הארה במקום, בזמן ובעוצמה לא רצויים, והארה של מערכות אקולוגיות המשבשת דפוסי תאורה טבעיים (ברוקוביץ ולבין, 2017).</w:t>
+        <w:t xml:space="preserve">זיהום אור מאגד את כלל ההשפעות השליליות של תאורה מלאכותית: הארה במקום, בזמן ובעוצמה לא רצויים, והארה ישירה או עקיפה של מערכות אקולוגיות, המשבשת דפוסי תאורה טבעיים (ברוקוביץ ולבין, 2017).</w:t>
       </w:r>
     </w:p>
     <w:p>
@@ -379,7 +379,7 @@
         <w:rPr>
           <w:rtl/>
         </w:rPr>
-        <w:t xml:space="preserve">זיהום אור עלול לפגוע ביצרנות הראשונית, בחלוקת זמני הפעילות בין מינים, בתפקוד השעון הביולוגי, במחזורי חיים ירחיים ועונתיים, באיתור משאבים ואויבים טבעיים, ביחסי טורף-נטרף, בתקשורת, בניווט ובהתמצאות במרחב, וכן בפוריות ובהרכב המינים ברמת האוכלוסייה (ברוקוביץ ולבין, 2017).</w:t>
+        <w:t xml:space="preserve">זיהום אור עלול לפגוע ביצרנות הראשונית, בחלוקת זמני הפעילות בין מינים, בתפקוד השעון הביולוגי, במחזורי חיים ירחיים ועונתיים, באיתור משאבים ואויבים טבעיים, ביחסי טורף-נטרף, בתקשורת, בניווט ובהתמצאות במרחב, וברמת האוכלוסייה גם בפוריות, בתמותה ובהרכב המינים (ברוקוביץ ולבין, 2017).</w:t>
       </w:r>
     </w:p>
     <w:p>
@@ -459,7 +459,7 @@
         <w:rPr>
           <w:rtl/>
         </w:rPr>
-        <w:t xml:space="preserve">האור המלאכותי בלילה משבש את הפרשת המלטונין ואת פעולת השעון הביולוגי, וגורם להפרעות שינה ולשיבוש חילוף החומרים והוויסות ההורמונלי. הפרעה מתמשכת מעלה סיכון להשמנת יתר, לסוכרת, לדיכאון, לדיכוי מערכת החיסון ולסרטן השד (ברוקוביץ ולבין, 2017).</w:t>
+        <w:t xml:space="preserve">האור המלאכותי בלילה משבש את הפרשת המלטונין ואת פעולת השעון הביולוגי, וגורם להפרעות שינה ולשיבוש חילוף החומרים והוויסות ההורמונלי. הפרעה מתמשכת מעלה סיכון להשמנת יתר, לסוכרת, לדיכאון, לדיכוי מערכת החיסון ולסרטן השד, ולצד זאת מתבזבזת אנרגיה רבה (ברוקוביץ ולבין, 2017).</w:t>
       </w:r>
     </w:p>
     <w:p>
@@ -504,7 +504,7 @@
         <w:rPr>
           <w:rtl/>
         </w:rPr>
-        <w:t xml:space="preserve">א. לתכנן תאורה לפי מטרתה ולפי תקנים קיימים, כך שהאור יינתן רק במקום ובזמן הנדרשים; ב. להגביל את זמני ההארה וליצור שעות חושך, או להפחית עוצמה בשעות שהתאורה נדרשת פחות; ג. למנוע פליטת אור אל קו האופק ומעליו, למניעת זהירת רקיע ופלישת אור; ד. לצמצם שימוש לילי באור לבן עז באורכי גל קצרים (420-500 ננומטר), הפוגע באדם ובטבע (ברוקוביץ ולבין, 2017).</w:t>
+        <w:t xml:space="preserve">א. לתכנן תאורה לפי מטרתה ולפי מפרטים ותקנים קיימים, כך שהאור יינתן רק במקום ובזמן הנדרשים; ב. להגביל את זמני ההארה וליצור שעות חושך, או להפחית את עוצמת התאורה בשעות שהיא נדרשת פחות; ג. למנוע פליטת אור אל קו האופק ומעליו, למניעת זהירת רקיע, פלישת אור וסנוור; ד. לצמצם שימוש לילי באור לבן עז באורכי גל קצרים (420-500 ננומטר), הפוגע באדם ובטבע (ברוקוביץ ולבין, 2017).</w:t>
       </w:r>
     </w:p>
     <w:p>
@@ -541,7 +541,7 @@
         <w:rPr>
           <w:rtl/>
         </w:rPr>
-        <w:t xml:space="preserve">בניסוי שדה בשלוש ברכות טבעיות בנגב ובאזור ים המלח נמצאה השפעה שלילית מובהקת: מספר אירועי השתייה לשעה ירד בממוצע מכ-118 לכ-17, ומינים ששכיחותם נמוכה נעלמו כליל בלילות המוארים. אצל עטלפון לבן שוליים, המלווה את האדם, השתייה פחתה בברכה מבודדת אך לא בברכה הסמוכה ליישוב, כלומר ההשפעה תלויה גם במין ובמיקום (דומר ואחרים, 2017).</w:t>
+        <w:t xml:space="preserve">בניסוי שדה בשלוש ברכות טבעיות בנגב ובאזור ים המלח, שהשווה לילה חשוך ללילה מואר, נמצאה השפעה שלילית מובהקת וחדה: מספר אירועי השתייה לשעה ירד בממוצע מכ-118 לכ-17, ומינים ששכיחותם נמוכה נעלמו כליל בלילות המוארים. אצל עטלפון לבן שוליים, המלווה את האדם, השתייה פחתה בברכה מבודדת אך לא בברכה הסמוכה ליישוב, כלומר ההשפעה תלויה גם במין ובמיקום (דומר ואחרים, 2017).</w:t>
       </w:r>
     </w:p>
     <w:p>

</xml_diff>

<commit_message>
Add Levinsky College logo to assignment header
Co-Authored-By: Claude Fable 5 <noreply@anthropic.com>
Claude-Session: https://claude.ai/code/session_012XXMnuQ2SLoTVvDfXfh3KT
</commit_message>
<xml_diff>
--- a/docs/מטלת סיום פיזיולוגיה - זיהום אור - עם תשובות.docx
+++ b/docs/מטלת סיום פיזיולוגיה - זיהום אור - עם תשובות.docx
@@ -2,6 +2,44 @@
 <file path=word/document.xml><?xml version="1.0" encoding="utf-8"?>
 <w:document xmlns:wpc="http://schemas.microsoft.com/office/word/2010/wordprocessingCanvas" xmlns:cx="http://schemas.microsoft.com/office/drawing/2014/chartex" xmlns:cx1="http://schemas.microsoft.com/office/drawing/2015/9/8/chartex" xmlns:cx2="http://schemas.microsoft.com/office/drawing/2015/10/21/chartex" xmlns:cx3="http://schemas.microsoft.com/office/drawing/2016/5/9/chartex" xmlns:cx4="http://schemas.microsoft.com/office/drawing/2016/5/10/chartex" xmlns:cx5="http://schemas.microsoft.com/office/drawing/2016/5/11/chartex" xmlns:cx6="http://schemas.microsoft.com/office/drawing/2016/5/12/chartex" xmlns:cx7="http://schemas.microsoft.com/office/drawing/2016/5/13/chartex" xmlns:cx8="http://schemas.microsoft.com/office/drawing/2016/5/14/chartex" xmlns:mc="http://schemas.openxmlformats.org/markup-compatibility/2006" xmlns:aink="http://schemas.microsoft.com/office/drawing/2016/ink" xmlns:am3d="http://schemas.microsoft.com/office/drawing/2017/model3d" xmlns:o="urn:schemas-microsoft-com:office:office" xmlns:oel="http://schemas.microsoft.com/office/2019/extlst" xmlns:r="http://schemas.openxmlformats.org/officeDocument/2006/relationships" xmlns:m="http://schemas.openxmlformats.org/officeDocument/2006/math" xmlns:v="urn:schemas-microsoft-com:vml" xmlns:wp14="http://schemas.microsoft.com/office/word/2010/wordprocessingDrawing" xmlns:wp="http://schemas.openxmlformats.org/drawingml/2006/wordprocessingDrawing" xmlns:w10="urn:schemas-microsoft-com:office:word" xmlns:w="http://schemas.openxmlformats.org/wordprocessingml/2006/main" xmlns:w14="http://schemas.microsoft.com/office/word/2010/wordml" xmlns:w15="http://schemas.microsoft.com/office/word/2012/wordml" xmlns:w16cex="http://schemas.microsoft.com/office/word/2018/wordml/cex" xmlns:w16cid="http://schemas.microsoft.com/office/word/2016/wordml/cid" xmlns:w16="http://schemas.microsoft.com/office/word/2018/wordml" xmlns:w16du="http://schemas.microsoft.com/office/word/2023/wordml/word16du" xmlns:w16sdtdh="http://schemas.microsoft.com/office/word/2020/wordml/sdtdatahash" xmlns:w16sdtfl="http://schemas.microsoft.com/office/word/2024/wordml/sdtformatlock" xmlns:w16se="http://schemas.microsoft.com/office/word/2015/wordml/symex" xmlns:wpg="http://schemas.microsoft.com/office/word/2010/wordprocessingGroup" xmlns:wpi="http://schemas.microsoft.com/office/word/2010/wordprocessingInk" xmlns:wne="http://schemas.microsoft.com/office/word/2006/wordml" xmlns:wps="http://schemas.microsoft.com/office/word/2010/wordprocessingShape" mc:Ignorable="w14 w15 w16se w16cid w16 w16cex w16sdtdh w16sdtfl w16du wp14">
   <w:body>
+    <w:p>
+      <w:pPr>
+        <w:jc w:val="center"/>
+      </w:pPr>
+      <w:r>
+        <w:drawing>
+          <wp:inline xmlns:wp="http://schemas.openxmlformats.org/drawingml/2006/wordprocessingDrawing" distT="0" distB="0" distL="0" distR="0">
+            <wp:extent cx="1620000" cy="784775"/>
+            <wp:docPr id="100" name="College logo"/>
+            <a:graphic xmlns:a="http://schemas.openxmlformats.org/drawingml/2006/main">
+              <a:graphicData uri="http://schemas.openxmlformats.org/drawingml/2006/picture">
+                <pic:pic xmlns:pic="http://schemas.openxmlformats.org/drawingml/2006/picture">
+                  <pic:nvPicPr>
+                    <pic:cNvPr id="100" name="logo.png"/>
+                    <pic:cNvPicPr/>
+                  </pic:nvPicPr>
+                  <pic:blipFill>
+                    <a:blip r:embed="rId100"/>
+                    <a:stretch>
+                      <a:fillRect/>
+                    </a:stretch>
+                  </pic:blipFill>
+                  <pic:spPr>
+                    <a:xfrm>
+                      <a:off x="0" y="0"/>
+                      <a:ext cx="1620000" cy="784775"/>
+                    </a:xfrm>
+                    <a:prstGeom prst="rect">
+                      <a:avLst/>
+                    </a:prstGeom>
+                  </pic:spPr>
+                </pic:pic>
+              </a:graphicData>
+            </a:graphic>
+          </wp:inline>
+        </w:drawing>
+      </w:r>
+    </w:p>
     <w:p>
       <w:pPr>
         <w:pStyle w:val="a3"/>

</xml_diff>

<commit_message>
Expand answers with additional article content within line limits
Co-Authored-By: Claude Fable 5 <noreply@anthropic.com>
Claude-Session: https://claude.ai/code/session_012XXMnuQ2SLoTVvDfXfh3KT
</commit_message>
<xml_diff>
--- a/docs/מטלת סיום פיזיולוגיה - זיהום אור - עם תשובות.docx
+++ b/docs/מטלת סיום פיזיולוגיה - זיהום אור - עם תשובות.docx
@@ -383,7 +383,7 @@
         <w:rPr>
           <w:rtl/>
         </w:rPr>
-        <w:t xml:space="preserve">זיהום אור מאגד את כלל ההשפעות השליליות של תאורה מלאכותית: הארה במקום, בזמן ובעוצמה לא רצויים, והארה ישירה או עקיפה של מערכות אקולוגיות, המשבשת דפוסי תאורה טבעיים (ברוקוביץ ולבין, 2017).</w:t>
+        <w:t xml:space="preserve">זיהום אור מאגד את כלל ההשפעות השליליות של תאורה מלאכותית: הארה במקום, בזמן ובעוצמה לא רצויים, והארה ישירה ועקיפה של מערכות אקולוגיות, המשבשת דפוסי תאורה טבעיים כגון תזמון, עוצמה וספקטרום (ברוקוביץ ולבין, 2017).</w:t>
       </w:r>
     </w:p>
     <w:p>
@@ -417,7 +417,7 @@
         <w:rPr>
           <w:rtl/>
         </w:rPr>
-        <w:t xml:space="preserve">זיהום אור עלול לפגוע ביצרנות הראשונית, בחלוקת זמני הפעילות בין מינים, בתפקוד השעון הביולוגי, במחזורי חיים ירחיים ועונתיים, באיתור משאבים ואויבים טבעיים, ביחסי טורף-נטרף, בתקשורת, בניווט ובהתמצאות במרחב, וברמת האוכלוסייה גם בפוריות, בתמותה ובהרכב המינים (ברוקוביץ ולבין, 2017).</w:t>
+        <w:t xml:space="preserve">זיהום אור עלול לפגוע ביצרנות הראשונית, בחלוקת זמני הפעילות בין מינים, בתפקוד השעון הביולוגי, בהבראת תפקודים פיזיולוגיים, במחזורי חיים ירחיים ועונתיים, באיתור משאבים ואויבים טבעיים, ביחסי טורף-נטרף, בתקשורת, בתחרות, בניווט ובהתמצאות במרחב, וברמת האוכלוסייה גם בפוריות, בתמותה ובהרכב המינים (ברוקוביץ ולבין, 2017).</w:t>
       </w:r>
     </w:p>
     <w:p>
@@ -497,7 +497,7 @@
         <w:rPr>
           <w:rtl/>
         </w:rPr>
-        <w:t xml:space="preserve">האור המלאכותי בלילה משבש את הפרשת המלטונין ואת פעולת השעון הביולוגי, וגורם להפרעות שינה ולשיבוש חילוף החומרים והוויסות ההורמונלי. הפרעה מתמשכת מעלה סיכון להשמנת יתר, לסוכרת, לדיכאון, לדיכוי מערכת החיסון ולסרטן השד, ולצד זאת מתבזבזת אנרגיה רבה (ברוקוביץ ולבין, 2017).</w:t>
+        <w:t xml:space="preserve">האור המלאכותי בלילה משבש את הפרשת המלטונין ואת פעולת השעון הביולוגי, וגורם להפרעות שינה ולשיבוש חילוף החומרים והוויסות ההורמונלי. הפרעה מתמשכת מעלה סיכון להשמנת יתר, לסוכרת, לדיכאון, לדיכוי מערכת החיסון ולסרטן השד, ולצד הנזק הבריאותי מתבזבזת אנרגיה רבה ונפגעת היכולת לצפות בשמי הלילה (ברוקוביץ ולבין, 2017).</w:t>
       </w:r>
     </w:p>
     <w:p>
@@ -542,7 +542,7 @@
         <w:rPr>
           <w:rtl/>
         </w:rPr>
-        <w:t xml:space="preserve">א. לתכנן תאורה לפי מטרתה ולפי מפרטים ותקנים קיימים, כך שהאור יינתן רק במקום ובזמן הנדרשים; ב. להגביל את זמני ההארה וליצור שעות חושך, או להפחית את עוצמת התאורה בשעות שהיא נדרשת פחות; ג. למנוע פליטת אור אל קו האופק ומעליו, למניעת זהירת רקיע, פלישת אור וסנוור; ד. לצמצם שימוש לילי באור לבן עז באורכי גל קצרים (420-500 ננומטר), הפוגע באדם ובטבע (ברוקוביץ ולבין, 2017).</w:t>
+        <w:t xml:space="preserve">א. לתכנן תאורה לפי מטרתה ולפי מפרטים ותקנים קיימים, כך שהאור יינתן רק במקום ובזמן הנדרשים; ב. להגביל את זמני ההארה וליצור שעות חושך, בייחוד באזורים רגישים כשמורות טבע ושטחים פתוחים, או להפחית את עוצמת התאורה בשעות שהיא נדרשת פחות; ג. למנוע פליטת אור אל קו האופק ומעליו, למניעת זהירת רקיע, פלישת אור וסנוור; ד. לצמצם שימוש לילי באור לבן עז באורכי גל קצרים (420-500 ננומטר), הפוגע באדם ובטבע (ברוקוביץ ולבין, 2017).</w:t>
       </w:r>
     </w:p>
     <w:p>
@@ -579,7 +579,7 @@
         <w:rPr>
           <w:rtl/>
         </w:rPr>
-        <w:t xml:space="preserve">בניסוי שדה בשלוש ברכות טבעיות בנגב ובאזור ים המלח, שהשווה לילה חשוך ללילה מואר, נמצאה השפעה שלילית מובהקת וחדה: מספר אירועי השתייה לשעה ירד בממוצע מכ-118 לכ-17, ומינים ששכיחותם נמוכה נעלמו כליל בלילות המוארים. אצל עטלפון לבן שוליים, המלווה את האדם, השתייה פחתה בברכה מבודדת אך לא בברכה הסמוכה ליישוב, כלומר ההשפעה תלויה גם במין ובמיקום (דומר ואחרים, 2017).</w:t>
+        <w:t xml:space="preserve">בניסוי שדה בשלוש ברכות טבעיות בנגב ובאזור ים המלח, שהשווה לילה חשוך ללילה מואר, תועדו 11 מיני עטלפי חרקים ונמצאה השפעה שלילית מובהקת וחדה: מספר אירועי השתייה לשעה ירד בממוצע מכ-118 לכ-17, ומינים ששכיחותם נמוכה נעלמו כליל בלילות המוארים. אצל עטלפון לבן שוליים, המלווה את האדם, השתייה פחתה בברכה מבודדת אך לא בברכה הסמוכה ליישוב, כלומר ההשפעה תלויה גם במין ובמיקום (דומר ואחרים, 2017).</w:t>
       </w:r>
     </w:p>
     <w:p>

</xml_diff>

<commit_message>
Enrich answers with article-specific data and fix blank page before references
Co-Authored-By: Claude Fable 5 <noreply@anthropic.com>
Claude-Session: https://claude.ai/code/session_012XXMnuQ2SLoTVvDfXfh3KT
</commit_message>
<xml_diff>
--- a/docs/מטלת סיום פיזיולוגיה - זיהום אור - עם תשובות.docx
+++ b/docs/מטלת סיום פיזיולוגיה - זיהום אור - עם תשובות.docx
@@ -497,7 +497,7 @@
         <w:rPr>
           <w:rtl/>
         </w:rPr>
-        <w:t xml:space="preserve">האור המלאכותי בלילה משבש את הפרשת המלטונין ואת פעולת השעון הביולוגי, וגורם להפרעות שינה ולשיבוש חילוף החומרים והוויסות ההורמונלי. הפרעה מתמשכת מעלה סיכון להשמנת יתר, לסוכרת, לדיכאון, לדיכוי מערכת החיסון ולסרטן השד, ולצד הנזק הבריאותי מתבזבזת אנרגיה רבה ונפגעת היכולת לצפות בשמי הלילה (ברוקוביץ ולבין, 2017).</w:t>
+        <w:t xml:space="preserve">האור המלאכותי בלילה, בעיקר אור כחול של כ-460 ננומטר, משבש את הפרשת המלטונין ואת פעולת השעון הביולוגי, וגורם להפרעות שינה ולשיבוש חילוף החומרים והוויסות ההורמונלי. הפרעה מתמשכת מעלה סיכון להשמנת יתר, לסוכרת, לדיכאון, לדיכוי מערכת החיסון ולסרטן השד, ולצד זאת מתבזבזת אנרגיה רבה ונפגעת היכולת לצפות בשמי הלילה (ברוקוביץ ולבין, 2017).</w:t>
       </w:r>
     </w:p>
     <w:p>
@@ -542,7 +542,7 @@
         <w:rPr>
           <w:rtl/>
         </w:rPr>
-        <w:t xml:space="preserve">א. לתכנן תאורה לפי מטרתה ולפי מפרטים ותקנים קיימים, כך שהאור יינתן רק במקום ובזמן הנדרשים; ב. להגביל את זמני ההארה וליצור שעות חושך, בייחוד באזורים רגישים כשמורות טבע ושטחים פתוחים, או להפחית את עוצמת התאורה בשעות שהיא נדרשת פחות; ג. למנוע פליטת אור אל קו האופק ומעליו, למניעת זהירת רקיע, פלישת אור וסנוור; ד. לצמצם שימוש לילי באור לבן עז באורכי גל קצרים (420-500 ננומטר), הפוגע באדם ובטבע (ברוקוביץ ולבין, 2017).</w:t>
+        <w:t xml:space="preserve">א. לתכנן תאורה לפי מטרתה ולפי מפרטים ותקנים קיימים, כך שהאור יינתן רק במקום ובזמן הנדרשים וייחסך בזבוז אנרגיה; ב. להגביל את זמני ההארה וליצור שעות חושך, בייחוד באזורים רגישים כשמורות טבע ושטחים פתוחים, או להפחית את עוצמת התאורה בשעות שהיא נדרשת פחות; ג. למנוע פליטת אור אל קו האופק ומעליו, למניעת זהירת רקיע, פלישת אור וסנוור; ד. לצמצם שימוש לילי באור לבן עז באורכי גל קצרים (420-500 ננומטר), הפוגע באדם ובטבע (ברוקוביץ ולבין, 2017).</w:t>
       </w:r>
     </w:p>
     <w:p>
@@ -579,7 +579,7 @@
         <w:rPr>
           <w:rtl/>
         </w:rPr>
-        <w:t xml:space="preserve">בניסוי שדה בשלוש ברכות טבעיות בנגב ובאזור ים המלח, שהשווה לילה חשוך ללילה מואר, תועדו 11 מיני עטלפי חרקים ונמצאה השפעה שלילית מובהקת וחדה: מספר אירועי השתייה לשעה ירד בממוצע מכ-118 לכ-17, ומינים ששכיחותם נמוכה נעלמו כליל בלילות המוארים. אצל עטלפון לבן שוליים, המלווה את האדם, השתייה פחתה בברכה מבודדת אך לא בברכה הסמוכה ליישוב, כלומר ההשפעה תלויה גם במין ובמיקום (דומר ואחרים, 2017).</w:t>
+        <w:t xml:space="preserve">בניסוי שדה בשלוש ברכות טבעיות בנגב ובאזור ים המלח, שהשווה לילה חשוך ללילה מואר, תועדו 11 מיני עטלפי חרקים ושמונה מהם שתו בברכות. לתאורה נמצאה השפעה שלילית מובהקת וחדה: מספר אירועי השתייה לשעה ירד בממוצע מכ-118 לכ-17, ומינים ששכיחותם נמוכה נעלמו כליל בלילות המוארים ושבו רק כעבור כמה לילות. אצל עטלפון לבן שוליים, המלווה את האדם, השתייה פחתה בברכה מבודדת אך לא בברכה הסמוכה ליישוב, כלומר ההשפעה תלויה גם במין ובמיקום (דומר ואחרים, 2017).</w:t>
       </w:r>
     </w:p>
     <w:p>
@@ -623,19 +623,7 @@
     <w:p>
       <w:pPr>
         <w:pStyle w:val="a3"/>
-        <w:rPr>
-          <w:rtl/>
-        </w:rPr>
-      </w:pPr>
-    </w:p>
-    <w:p>
-      <w:r>
-        <w:br w:type="page"/>
-      </w:r>
-    </w:p>
-    <w:p>
-      <w:pPr>
-        <w:pStyle w:val="a3"/>
+        <w:pageBreakBefore/>
         <w:jc w:val="center"/>
         <w:rPr>
           <w:b/>

</xml_diff>

<commit_message>
Fill in student name and ID
Co-Authored-By: Claude Fable 5 <noreply@anthropic.com>
Claude-Session: https://claude.ai/code/session_012XXMnuQ2SLoTVvDfXfh3KT
</commit_message>
<xml_diff>
--- a/docs/מטלת סיום פיזיולוגיה - זיהום אור - עם תשובות.docx
+++ b/docs/מטלת סיום פיזיולוגיה - זיהום אור - עם תשובות.docx
@@ -105,7 +105,7 @@
           <w:rFonts w:hint="cs"/>
           <w:rtl/>
         </w:rPr>
-        <w:t>שם הסטודנטית:________________</w:t>
+        <w:t>שם הסטודנטית: נוהא אזברגה</w:t>
       </w:r>
     </w:p>
     <w:p>
@@ -120,7 +120,7 @@
           <w:rFonts w:hint="cs"/>
           <w:rtl/>
         </w:rPr>
-        <w:t>ת.ז._______________</w:t>
+        <w:t>ת.ז. 213830078</w:t>
       </w:r>
     </w:p>
     <w:p>

</xml_diff>